<commit_message>
api-quirks-for-eng: add wrong-provider errors, zero-NTE 1104, SkillLevel 1194, single open invoice, reject reason
Co-Authored-By: Claude Sonnet 5.5 <noreply@anthropic.com>
</commit_message>
<xml_diff>
--- a/docs/api-quirks-for-eng.docx
+++ b/docs/api-quirks-for-eng.docx
@@ -1743,6 +1743,307 @@
     </w:p>
     <w:p>
       <w:pPr>
+        <w:pStyle w:val="ListParagraph"/>
+        <w:numPr>
+          <w:ilvl w:val="0"/>
+          <w:numId w:val="1"/>
+        </w:numPr>
+        <w:spacing w:after="60" w:before="0" w:line="276"/>
+      </w:pPr>
+      <w:r>
+        <w:rPr>
+          <w:rFonts w:ascii="Arial" w:cs="Arial" w:eastAsia="Arial" w:hAnsi="Arial"/>
+          <w:sz w:val="20"/>
+          <w:szCs w:val="20"/>
+        </w:rPr>
+        <w:t xml:space="preserve">A Provider user from the wrong provider gets </w:t>
+      </w:r>
+      <w:r>
+        <w:rPr>
+          <w:rFonts w:ascii="Courier New" w:cs="Courier New" w:eastAsia="Courier New" w:hAnsi="Courier New"/>
+          <w:color w:val="5A6472"/>
+          <w:sz w:val="18"/>
+          <w:szCs w:val="18"/>
+        </w:rPr>
+        <w:t xml:space="preserve">917 Invalid Tracking Number</w:t>
+      </w:r>
+      <w:r>
+        <w:rPr>
+          <w:rFonts w:ascii="Arial" w:cs="Arial" w:eastAsia="Arial" w:hAnsi="Arial"/>
+          <w:sz w:val="20"/>
+          <w:szCs w:val="20"/>
+        </w:rPr>
+        <w:t xml:space="preserve"> on </w:t>
+      </w:r>
+      <w:r>
+        <w:rPr>
+          <w:rFonts w:ascii="Courier New" w:cs="Courier New" w:eastAsia="Courier New" w:hAnsi="Courier New"/>
+          <w:color w:val="5A6472"/>
+          <w:sz w:val="18"/>
+          <w:szCs w:val="18"/>
+        </w:rPr>
+        <w:t xml:space="preserve">POST /invoices</w:t>
+      </w:r>
+      <w:r>
+        <w:rPr>
+          <w:rFonts w:ascii="Arial" w:cs="Arial" w:eastAsia="Arial" w:hAnsi="Arial"/>
+          <w:sz w:val="20"/>
+          <w:szCs w:val="20"/>
+        </w:rPr>
+        <w:t xml:space="preserve"> and </w:t>
+      </w:r>
+      <w:r>
+        <w:rPr>
+          <w:rFonts w:ascii="Courier New" w:cs="Courier New" w:eastAsia="Courier New" w:hAnsi="Courier New"/>
+          <w:color w:val="5A6472"/>
+          <w:sz w:val="18"/>
+          <w:szCs w:val="18"/>
+        </w:rPr>
+        <w:t xml:space="preserve">502 Work order is not found</w:t>
+      </w:r>
+      <w:r>
+        <w:rPr>
+          <w:rFonts w:ascii="Arial" w:cs="Arial" w:eastAsia="Arial" w:hAnsi="Arial"/>
+          <w:sz w:val="20"/>
+          <w:szCs w:val="20"/>
+        </w:rPr>
+        <w:t xml:space="preserve"> on the WO, not a permission error. When the integration tries several users, the real error is hidden behind these.</w:t>
+      </w:r>
+    </w:p>
+    <w:p>
+      <w:pPr>
+        <w:pStyle w:val="ListParagraph"/>
+        <w:numPr>
+          <w:ilvl w:val="0"/>
+          <w:numId w:val="1"/>
+        </w:numPr>
+        <w:spacing w:after="60" w:before="0" w:line="276"/>
+      </w:pPr>
+      <w:r>
+        <w:rPr>
+          <w:rFonts w:ascii="Courier New" w:cs="Courier New" w:eastAsia="Courier New" w:hAnsi="Courier New"/>
+          <w:color w:val="5A6472"/>
+          <w:sz w:val="18"/>
+          <w:szCs w:val="18"/>
+        </w:rPr>
+        <w:t xml:space="preserve">POST /invoices</w:t>
+      </w:r>
+      <w:r>
+        <w:rPr>
+          <w:rFonts w:ascii="Arial" w:cs="Arial" w:eastAsia="Arial" w:hAnsi="Arial"/>
+          <w:sz w:val="20"/>
+          <w:szCs w:val="20"/>
+        </w:rPr>
+        <w:t xml:space="preserve"> on a WO with </w:t>
+      </w:r>
+      <w:r>
+        <w:rPr>
+          <w:rFonts w:ascii="Courier New" w:cs="Courier New" w:eastAsia="Courier New" w:hAnsi="Courier New"/>
+          <w:color w:val="5A6472"/>
+          <w:sz w:val="18"/>
+          <w:szCs w:val="18"/>
+        </w:rPr>
+        <w:t xml:space="preserve">Nte</w:t>
+      </w:r>
+      <w:r>
+        <w:rPr>
+          <w:rFonts w:ascii="Arial" w:cs="Arial" w:eastAsia="Arial" w:hAnsi="Arial"/>
+          <w:sz w:val="20"/>
+          <w:szCs w:val="20"/>
+        </w:rPr>
+        <w:t xml:space="preserve"> 0 returns </w:t>
+      </w:r>
+      <w:r>
+        <w:rPr>
+          <w:rFonts w:ascii="Courier New" w:cs="Courier New" w:eastAsia="Courier New" w:hAnsi="Courier New"/>
+          <w:color w:val="5A6472"/>
+          <w:sz w:val="18"/>
+          <w:szCs w:val="18"/>
+        </w:rPr>
+        <w:t xml:space="preserve">1104 Invoice Total &gt; NTE 0.0000</w:t>
+      </w:r>
+      <w:r>
+        <w:rPr>
+          <w:rFonts w:ascii="Arial" w:cs="Arial" w:eastAsia="Arial" w:hAnsi="Arial"/>
+          <w:sz w:val="20"/>
+          <w:szCs w:val="20"/>
+        </w:rPr>
+        <w:t xml:space="preserve">. The WO reports </w:t>
+      </w:r>
+      <w:r>
+        <w:rPr>
+          <w:rFonts w:ascii="Courier New" w:cs="Courier New" w:eastAsia="Courier New" w:hAnsi="Courier New"/>
+          <w:color w:val="5A6472"/>
+          <w:sz w:val="18"/>
+          <w:szCs w:val="18"/>
+        </w:rPr>
+        <w:t xml:space="preserve">Status.CanCreateInvoice: false</w:t>
+      </w:r>
+      <w:r>
+        <w:rPr>
+          <w:rFonts w:ascii="Arial" w:cs="Arial" w:eastAsia="Arial" w:hAnsi="Arial"/>
+          <w:sz w:val="20"/>
+          <w:szCs w:val="20"/>
+        </w:rPr>
+        <w:t xml:space="preserve">, but nothing in the error says the WO cannot be invoiced.</w:t>
+      </w:r>
+    </w:p>
+    <w:p>
+      <w:pPr>
+        <w:pStyle w:val="ListParagraph"/>
+        <w:numPr>
+          <w:ilvl w:val="0"/>
+          <w:numId w:val="1"/>
+        </w:numPr>
+        <w:spacing w:after="60" w:before="0" w:line="276"/>
+      </w:pPr>
+      <w:r>
+        <w:rPr>
+          <w:rFonts w:ascii="Arial" w:cs="Arial" w:eastAsia="Arial" w:hAnsi="Arial"/>
+          <w:sz w:val="20"/>
+          <w:szCs w:val="20"/>
+        </w:rPr>
+        <w:t xml:space="preserve">A Labors line without </w:t>
+      </w:r>
+      <w:r>
+        <w:rPr>
+          <w:rFonts w:ascii="Courier New" w:cs="Courier New" w:eastAsia="Courier New" w:hAnsi="Courier New"/>
+          <w:color w:val="5A6472"/>
+          <w:sz w:val="18"/>
+          <w:szCs w:val="18"/>
+        </w:rPr>
+        <w:t xml:space="preserve">SkillLevel</w:t>
+      </w:r>
+      <w:r>
+        <w:rPr>
+          <w:rFonts w:ascii="Arial" w:cs="Arial" w:eastAsia="Arial" w:hAnsi="Arial"/>
+          <w:sz w:val="20"/>
+          <w:szCs w:val="20"/>
+        </w:rPr>
+        <w:t xml:space="preserve"> returns </w:t>
+      </w:r>
+      <w:r>
+        <w:rPr>
+          <w:rFonts w:ascii="Courier New" w:cs="Courier New" w:eastAsia="Courier New" w:hAnsi="Courier New"/>
+          <w:color w:val="5A6472"/>
+          <w:sz w:val="18"/>
+          <w:szCs w:val="18"/>
+        </w:rPr>
+        <w:t xml:space="preserve">1194</w:t>
+      </w:r>
+      <w:r>
+        <w:rPr>
+          <w:rFonts w:ascii="Arial" w:cs="Arial" w:eastAsia="Arial" w:hAnsi="Arial"/>
+          <w:sz w:val="20"/>
+          <w:szCs w:val="20"/>
+        </w:rPr>
+        <w:t xml:space="preserve">. The required fields (</w:t>
+      </w:r>
+      <w:r>
+        <w:rPr>
+          <w:rFonts w:ascii="Courier New" w:cs="Courier New" w:eastAsia="Courier New" w:hAnsi="Courier New"/>
+          <w:color w:val="5A6472"/>
+          <w:sz w:val="18"/>
+          <w:szCs w:val="18"/>
+        </w:rPr>
+        <w:t xml:space="preserve">SkillLevel</w:t>
+      </w:r>
+      <w:r>
+        <w:rPr>
+          <w:rFonts w:ascii="Arial" w:cs="Arial" w:eastAsia="Arial" w:hAnsi="Arial"/>
+          <w:sz w:val="20"/>
+          <w:szCs w:val="20"/>
+        </w:rPr>
+        <w:t xml:space="preserve">, </w:t>
+      </w:r>
+      <w:r>
+        <w:rPr>
+          <w:rFonts w:ascii="Courier New" w:cs="Courier New" w:eastAsia="Courier New" w:hAnsi="Courier New"/>
+          <w:color w:val="5A6472"/>
+          <w:sz w:val="18"/>
+          <w:szCs w:val="18"/>
+        </w:rPr>
+        <w:t xml:space="preserve">LaborType</w:t>
+      </w:r>
+      <w:r>
+        <w:rPr>
+          <w:rFonts w:ascii="Arial" w:cs="Arial" w:eastAsia="Arial" w:hAnsi="Arial"/>
+          <w:sz w:val="20"/>
+          <w:szCs w:val="20"/>
+        </w:rPr>
+        <w:t xml:space="preserve">, </w:t>
+      </w:r>
+      <w:r>
+        <w:rPr>
+          <w:rFonts w:ascii="Courier New" w:cs="Courier New" w:eastAsia="Courier New" w:hAnsi="Courier New"/>
+          <w:color w:val="5A6472"/>
+          <w:sz w:val="18"/>
+          <w:szCs w:val="18"/>
+        </w:rPr>
+        <w:t xml:space="preserve">NumOfTech</w:t>
+      </w:r>
+      <w:r>
+        <w:rPr>
+          <w:rFonts w:ascii="Arial" w:cs="Arial" w:eastAsia="Arial" w:hAnsi="Arial"/>
+          <w:sz w:val="20"/>
+          <w:szCs w:val="20"/>
+        </w:rPr>
+        <w:t xml:space="preserve">, </w:t>
+      </w:r>
+      <w:r>
+        <w:rPr>
+          <w:rFonts w:ascii="Courier New" w:cs="Courier New" w:eastAsia="Courier New" w:hAnsi="Courier New"/>
+          <w:color w:val="5A6472"/>
+          <w:sz w:val="18"/>
+          <w:szCs w:val="18"/>
+        </w:rPr>
+        <w:t xml:space="preserve">HourlyRate</w:t>
+      </w:r>
+      <w:r>
+        <w:rPr>
+          <w:rFonts w:ascii="Arial" w:cs="Arial" w:eastAsia="Arial" w:hAnsi="Arial"/>
+          <w:sz w:val="20"/>
+          <w:szCs w:val="20"/>
+        </w:rPr>
+        <w:t xml:space="preserve">, </w:t>
+      </w:r>
+      <w:r>
+        <w:rPr>
+          <w:rFonts w:ascii="Courier New" w:cs="Courier New" w:eastAsia="Courier New" w:hAnsi="Courier New"/>
+          <w:color w:val="5A6472"/>
+          <w:sz w:val="18"/>
+          <w:szCs w:val="18"/>
+        </w:rPr>
+        <w:t xml:space="preserve">Hours</w:t>
+      </w:r>
+      <w:r>
+        <w:rPr>
+          <w:rFonts w:ascii="Arial" w:cs="Arial" w:eastAsia="Arial" w:hAnsi="Arial"/>
+          <w:sz w:val="20"/>
+          <w:szCs w:val="20"/>
+        </w:rPr>
+        <w:t xml:space="preserve">, </w:t>
+      </w:r>
+      <w:r>
+        <w:rPr>
+          <w:rFonts w:ascii="Courier New" w:cs="Courier New" w:eastAsia="Courier New" w:hAnsi="Courier New"/>
+          <w:color w:val="5A6472"/>
+          <w:sz w:val="18"/>
+          <w:szCs w:val="18"/>
+        </w:rPr>
+        <w:t xml:space="preserve">Amount</w:t>
+      </w:r>
+      <w:r>
+        <w:rPr>
+          <w:rFonts w:ascii="Arial" w:cs="Arial" w:eastAsia="Arial" w:hAnsi="Arial"/>
+          <w:sz w:val="20"/>
+          <w:szCs w:val="20"/>
+        </w:rPr>
+        <w:t xml:space="preserve">) are only in the developer guide, not in the error.</w:t>
+      </w:r>
+    </w:p>
+    <w:p>
+      <w:pPr>
         <w:pStyle w:val="Heading3"/>
         <w:spacing w:after="80" w:before="160" w:line="276"/>
       </w:pPr>
@@ -2273,6 +2574,147 @@
           <w:szCs w:val="20"/>
         </w:rPr>
         <w:t xml:space="preserve"> works.</w:t>
+      </w:r>
+    </w:p>
+    <w:p>
+      <w:pPr>
+        <w:pStyle w:val="ListParagraph"/>
+        <w:numPr>
+          <w:ilvl w:val="0"/>
+          <w:numId w:val="1"/>
+        </w:numPr>
+        <w:spacing w:after="60" w:before="0" w:line="276"/>
+      </w:pPr>
+      <w:r>
+        <w:rPr>
+          <w:rFonts w:ascii="Arial" w:cs="Arial" w:eastAsia="Arial" w:hAnsi="Arial"/>
+          <w:b/>
+          <w:bCs/>
+          <w:sz w:val="20"/>
+          <w:szCs w:val="20"/>
+        </w:rPr>
+        <w:t xml:space="preserve">One invoice at a time:</w:t>
+      </w:r>
+      <w:r>
+        <w:rPr>
+          <w:rFonts w:ascii="Arial" w:cs="Arial" w:eastAsia="Arial" w:hAnsi="Arial"/>
+          <w:sz w:val="20"/>
+          <w:szCs w:val="20"/>
+        </w:rPr>
+        <w:t xml:space="preserve"> a second </w:t>
+      </w:r>
+      <w:r>
+        <w:rPr>
+          <w:rFonts w:ascii="Courier New" w:cs="Courier New" w:eastAsia="Courier New" w:hAnsi="Courier New"/>
+          <w:color w:val="5A6472"/>
+          <w:sz w:val="18"/>
+          <w:szCs w:val="18"/>
+        </w:rPr>
+        <w:t xml:space="preserve">POST /invoices</w:t>
+      </w:r>
+      <w:r>
+        <w:rPr>
+          <w:rFonts w:ascii="Arial" w:cs="Arial" w:eastAsia="Arial" w:hAnsi="Arial"/>
+          <w:sz w:val="20"/>
+          <w:szCs w:val="20"/>
+        </w:rPr>
+        <w:t xml:space="preserve"> while one is OPEN or APPROVED returns </w:t>
+      </w:r>
+      <w:r>
+        <w:rPr>
+          <w:rFonts w:ascii="Courier New" w:cs="Courier New" w:eastAsia="Courier New" w:hAnsi="Courier New"/>
+          <w:color w:val="5A6472"/>
+          <w:sz w:val="18"/>
+          <w:szCs w:val="18"/>
+        </w:rPr>
+        <w:t xml:space="preserve">1105 Invoice exists</w:t>
+      </w:r>
+      <w:r>
+        <w:rPr>
+          <w:rFonts w:ascii="Arial" w:cs="Arial" w:eastAsia="Arial" w:hAnsi="Arial"/>
+          <w:sz w:val="20"/>
+          <w:szCs w:val="20"/>
+        </w:rPr>
+        <w:t xml:space="preserve">. Partial invoices and credit memos on the same WO are therefore not possible through the API. A new invoice works only after a reject.</w:t>
+      </w:r>
+    </w:p>
+    <w:p>
+      <w:pPr>
+        <w:pStyle w:val="ListParagraph"/>
+        <w:numPr>
+          <w:ilvl w:val="0"/>
+          <w:numId w:val="1"/>
+        </w:numPr>
+        <w:spacing w:after="60" w:before="0" w:line="276"/>
+      </w:pPr>
+      <w:r>
+        <w:rPr>
+          <w:rFonts w:ascii="Arial" w:cs="Arial" w:eastAsia="Arial" w:hAnsi="Arial"/>
+          <w:b/>
+          <w:bCs/>
+          <w:sz w:val="20"/>
+          <w:szCs w:val="20"/>
+        </w:rPr>
+        <w:t xml:space="preserve">Reject reason:</w:t>
+      </w:r>
+      <w:r>
+        <w:rPr>
+          <w:rFonts w:ascii="Arial" w:cs="Arial" w:eastAsia="Arial" w:hAnsi="Arial"/>
+          <w:sz w:val="20"/>
+          <w:szCs w:val="20"/>
+        </w:rPr>
+        <w:t xml:space="preserve"> </w:t>
+      </w:r>
+      <w:r>
+        <w:rPr>
+          <w:rFonts w:ascii="Courier New" w:cs="Courier New" w:eastAsia="Courier New" w:hAnsi="Courier New"/>
+          <w:color w:val="5A6472"/>
+          <w:sz w:val="18"/>
+          <w:szCs w:val="18"/>
+        </w:rPr>
+        <w:t xml:space="preserve">PUT /invoices/{id}/reject</w:t>
+      </w:r>
+      <w:r>
+        <w:rPr>
+          <w:rFonts w:ascii="Arial" w:cs="Arial" w:eastAsia="Arial" w:hAnsi="Arial"/>
+          <w:sz w:val="20"/>
+          <w:szCs w:val="20"/>
+        </w:rPr>
+        <w:t xml:space="preserve"> accepts </w:t>
+      </w:r>
+      <w:r>
+        <w:rPr>
+          <w:rFonts w:ascii="Courier New" w:cs="Courier New" w:eastAsia="Courier New" w:hAnsi="Courier New"/>
+          <w:color w:val="5A6472"/>
+          <w:sz w:val="18"/>
+          <w:szCs w:val="18"/>
+        </w:rPr>
+        <w:t xml:space="preserve">reasonId</w:t>
+      </w:r>
+      <w:r>
+        <w:rPr>
+          <w:rFonts w:ascii="Arial" w:cs="Arial" w:eastAsia="Arial" w:hAnsi="Arial"/>
+          <w:sz w:val="20"/>
+          <w:szCs w:val="20"/>
+        </w:rPr>
+        <w:t xml:space="preserve"> but does not record it. Only </w:t>
+      </w:r>
+      <w:r>
+        <w:rPr>
+          <w:rFonts w:ascii="Courier New" w:cs="Courier New" w:eastAsia="Courier New" w:hAnsi="Courier New"/>
+          <w:color w:val="5A6472"/>
+          <w:sz w:val="18"/>
+          <w:szCs w:val="18"/>
+        </w:rPr>
+        <w:t xml:space="preserve">comments</w:t>
+      </w:r>
+      <w:r>
+        <w:rPr>
+          <w:rFonts w:ascii="Arial" w:cs="Arial" w:eastAsia="Arial" w:hAnsi="Arial"/>
+          <w:sz w:val="20"/>
+          <w:szCs w:val="20"/>
+        </w:rPr>
+        <w:t xml:space="preserve"> is kept.</w:t>
       </w:r>
     </w:p>
     <w:p>

</xml_diff>